<commit_message>
docs: add conference poster, update thesis, drop internal planning notes
- add DocsForGradThesis/Poster.pptx + Poster.pdf (Ege University A1 thesis poster)
- update DP-FedBN_Thesis_EfeDenizBaglar.docx + .pdf
- remove DECISIONS.md and federated_ecg_master_plan.md (internal dev notes)
</commit_message>
<xml_diff>
--- a/DocsForGradThesis/DP-FedBN_Thesis_EfeDenizBaglar.docx
+++ b/DocsForGradThesis/DP-FedBN_Thesis_EfeDenizBaglar.docx
@@ -525,25 +525,7 @@
                                       <w:szCs w:val="24"/>
                                       <w:lang w:val="en-US"/>
                                     </w:rPr>
-                                    <w:t>Submission Date: 1</w:t>
-                                  </w:r>
-                                  <w:r>
-                                    <w:rPr>
-                                      <w:b/>
-                                      <w:color w:val="00006A"/>
-                                      <w:szCs w:val="24"/>
-                                      <w:lang w:val="en-US"/>
-                                    </w:rPr>
-                                    <w:t>5</w:t>
-                                  </w:r>
-                                  <w:r>
-                                    <w:rPr>
-                                      <w:b/>
-                                      <w:color w:val="00006A"/>
-                                      <w:szCs w:val="24"/>
-                                      <w:lang w:val="en-US"/>
-                                    </w:rPr>
-                                    <w:t>.06.2026</w:t>
+                                    <w:t>Submission Date: 15.06.2026</w:t>
                                   </w:r>
                                 </w:p>
                                 <w:p>
@@ -1487,25 +1469,7 @@
                                 <w:szCs w:val="24"/>
                                 <w:lang w:val="en-US"/>
                               </w:rPr>
-                              <w:t>Submission Date: 1</w:t>
-                            </w:r>
-                            <w:r>
-                              <w:rPr>
-                                <w:b/>
-                                <w:color w:val="00006A"/>
-                                <w:szCs w:val="24"/>
-                                <w:lang w:val="en-US"/>
-                              </w:rPr>
-                              <w:t>5</w:t>
-                            </w:r>
-                            <w:r>
-                              <w:rPr>
-                                <w:b/>
-                                <w:color w:val="00006A"/>
-                                <w:szCs w:val="24"/>
-                                <w:lang w:val="en-US"/>
-                              </w:rPr>
-                              <w:t>.06.2026</w:t>
+                              <w:t>Submission Date: 15.06.2026</w:t>
                             </w:r>
                           </w:p>
                           <w:p>
@@ -2102,37 +2066,18 @@
           </mc:Fallback>
         </mc:AlternateContent>
       </w:r>
-      <w:bookmarkStart w:id="0" w:name="_Toc386614952"/>
-      <w:bookmarkStart w:id="1" w:name="_Toc359983323"/>
-      <w:bookmarkStart w:id="2" w:name="_Toc359924107"/>
-      <w:bookmarkStart w:id="3" w:name="_Toc359922632"/>
-      <w:bookmarkStart w:id="4" w:name="_Toc386614952"/>
-      <w:bookmarkStart w:id="5" w:name="_Toc359983323"/>
-      <w:bookmarkStart w:id="6" w:name="_Toc359924107"/>
-      <w:bookmarkStart w:id="7" w:name="_Toc359922632"/>
+      <w:bookmarkStart w:id="0" w:name="_Toc359922632"/>
+      <w:bookmarkStart w:id="1" w:name="_Toc359924107"/>
+      <w:bookmarkStart w:id="2" w:name="_Toc359983323"/>
+      <w:bookmarkStart w:id="3" w:name="_Toc386614952"/>
+      <w:bookmarkStart w:id="4" w:name="_Toc359922632"/>
+      <w:bookmarkStart w:id="5" w:name="_Toc359924107"/>
+      <w:bookmarkStart w:id="6" w:name="_Toc359983323"/>
+      <w:bookmarkStart w:id="7" w:name="_Toc386614952"/>
       <w:bookmarkEnd w:id="4"/>
       <w:bookmarkEnd w:id="5"/>
       <w:bookmarkEnd w:id="6"/>
       <w:bookmarkEnd w:id="7"/>
-    </w:p>
-    <w:p>
-      <w:pPr>
-        <w:pStyle w:val="Yknbaslik"/>
-        <w:keepNext w:val="false"/>
-        <w:spacing w:lineRule="atLeast" w:line="240" w:before="0" w:after="360"/>
-        <w:rPr>
-          <w:sz w:val="24"/>
-          <w:szCs w:val="24"/>
-          <w:lang w:val="en-US"/>
-        </w:rPr>
-      </w:pPr>
-      <w:r>
-        <w:rPr>
-          <w:sz w:val="24"/>
-          <w:szCs w:val="24"/>
-          <w:lang w:val="en-US"/>
-        </w:rPr>
-      </w:r>
     </w:p>
     <w:p>
       <w:pPr>
@@ -2653,25 +2598,7 @@
           <w:szCs w:val="24"/>
           <w:lang w:val="en-US"/>
         </w:rPr>
-        <w:t>Submission Date: 1</w:t>
-      </w:r>
-      <w:r>
-        <w:rPr>
-          <w:b/>
-          <w:bCs/>
-          <w:szCs w:val="24"/>
-          <w:lang w:val="en-US"/>
-        </w:rPr>
-        <w:t>5</w:t>
-      </w:r>
-      <w:r>
-        <w:rPr>
-          <w:b/>
-          <w:bCs/>
-          <w:szCs w:val="24"/>
-          <w:lang w:val="en-US"/>
-        </w:rPr>
-        <w:t>.06.2026</w:t>
+        <w:t>Submission Date: 15.06.2026</w:t>
       </w:r>
     </w:p>
     <w:p>
@@ -2944,23 +2871,7 @@
       </w:pPr>
       <w:r>
         <w:rPr/>
-        <w:t>Undergraduate thesis titled "WHEN DOES FEDERATED BATCHNORM HELP UNDER DIFFERENTIAL PRIVACY? AN EVAL-REGIME CHARACTERIZATION OF DP-FEDBN ON MEDICAL ECG CLASSIFICATION", presented by Efe Deniz Bağlar and submitted by our institution, has been evaluated in accordance with the relevant provisions of the EU Undergraduate Education and Teaching Regulations and the EU Institute of Science Education and Teaching Directive. It has been found worthy of defense and was deemed successful unanimously/majority in the thesis defense examination held on 1</w:t>
-      </w:r>
-      <w:r>
-        <w:rPr/>
-        <w:t>3</w:t>
-      </w:r>
-      <w:r>
-        <w:rPr/>
-        <w:t>.0</w:t>
-      </w:r>
-      <w:r>
-        <w:rPr/>
-        <w:t>5</w:t>
-      </w:r>
-      <w:r>
-        <w:rPr/>
-        <w:t>.2026.</w:t>
+        <w:t>Undergraduate thesis titled "WHEN DOES FEDERATED BATCHNORM HELP UNDER DIFFERENTIAL PRIVACY? AN EVAL-REGIME CHARACTERIZATION OF DP-FEDBN ON MEDICAL ECG CLASSIFICATION", presented by Efe Deniz Bağlar and submitted by our institution, has been evaluated in accordance with the relevant provisions of the EU Undergraduate Education and Teaching Regulations and the EU Institute of Science Education and Teaching Directive. It has been found worthy of defense and was deemed successful unanimously/majority in the thesis defense examination held on 13.05.2026.</w:t>
       </w:r>
     </w:p>
     <w:p>
@@ -3075,7 +2986,17 @@
           <w:lang w:val="en-US"/>
         </w:rPr>
         <w:tab/>
-        <w:t>Hasan Bulut</w:t>
+      </w:r>
+      <w:r>
+        <w:rPr>
+          <w:lang w:val="en-US"/>
+        </w:rPr>
+        <w:t>N/A</w:t>
+      </w:r>
+      <w:r>
+        <w:rPr>
+          <w:lang w:val="en-US"/>
+        </w:rPr>
         <w:tab/>
         <w:t>N/A</w:t>
       </w:r>
@@ -3112,7 +3033,17 @@
           <w:lang w:val="en-US"/>
         </w:rPr>
         <w:tab/>
-        <w:t>Hasan Bulut</w:t>
+      </w:r>
+      <w:r>
+        <w:rPr>
+          <w:lang w:val="en-US"/>
+        </w:rPr>
+        <w:t>N/A</w:t>
+      </w:r>
+      <w:r>
+        <w:rPr>
+          <w:lang w:val="en-US"/>
+        </w:rPr>
         <w:tab/>
         <w:t>N/A</w:t>
       </w:r>
@@ -3270,19 +3201,7 @@
         </w:rPr>
         <w:tab/>
         <w:tab/>
-        <w:t>1</w:t>
-      </w:r>
-      <w:r>
-        <w:rPr>
-          <w:lang w:val="en-US"/>
-        </w:rPr>
-        <w:t>5</w:t>
-      </w:r>
-      <w:r>
-        <w:rPr>
-          <w:lang w:val="en-US"/>
-        </w:rPr>
-        <w:t>.06.2026</w:t>
+        <w:t>15.06.2026</w:t>
       </w:r>
     </w:p>
     <w:p>
@@ -19995,8 +19914,8 @@
         <w:pStyle w:val="TBody"/>
         <w:rPr/>
       </w:pPr>
-      <w:bookmarkStart w:id="42" w:name="ptb-xl"/>
-      <w:bookmarkStart w:id="43" w:name="mit-bih-arrhythmia-database"/>
+      <w:bookmarkStart w:id="42" w:name="mit-bih-arrhythmia-database"/>
+      <w:bookmarkStart w:id="43" w:name="ptb-xl"/>
       <w:r>
         <w:rPr/>
         <w:t>The choice of a binary PTB-XL task is deliberate and is documented here because it is a design decision rather than an arbitrary simplification. We initially attempted the PTB-XL five-super-class classification on Lead II. Three successive training regimes — a 44k-parameter model, then a 437k-parameter model with data augmentation and stronger regularization, and a cosine learning-rate schedule — all plateaued at a test macro F1 of approximately 0.50, with the hypertrophy (HYP) class stuck near 0.22. This was a representational bottleneck of single-lead input, not a capacity ceiling: the information needed to separate all five super-classes is not reliably present in Lead II alone. We therefore reformulated PTB-XL as a binary task (Normal versus Abnormal), which is well-defined on Lead II and reaches a balanced central macro F1 of approximately 0.81. Full multi-label PTB-XL classification using all twelve leads is a natural extension and is listed as future work in Chapter 7.</w:t>
@@ -35103,8 +35022,8 @@
         <w:pStyle w:val="TBody"/>
         <w:rPr/>
       </w:pPr>
-      <w:bookmarkStart w:id="64" w:name="future-work"/>
-      <w:bookmarkStart w:id="65" w:name="limitations-1"/>
+      <w:bookmarkStart w:id="64" w:name="limitations-1"/>
+      <w:bookmarkStart w:id="65" w:name="future-work"/>
       <w:r>
         <w:rPr/>
         <w:t>Taken together, these directions would move DP-FedBN from a carefully characterized single-seed construction on two ECG tasks toward a validated tool for privacy-preserving, personalized medical federated learning. The construction itself — keep BatchNorm local, protect only what crosses the boundary, and report both evaluation regimes — is the contribution this thesis stands behind, in exactly those measured terms.</w:t>
@@ -36213,7 +36132,7 @@
       <w:rPr>
         <w:rStyle w:val="Pagenumber"/>
       </w:rPr>
-      <w:t>26</w:t>
+      <w:t>61</w:t>
     </w:r>
     <w:r>
       <w:rPr>
@@ -43166,7 +43085,7 @@
         <w:tab w:val="left" w:pos="567" w:leader="none"/>
       </w:tabs>
       <w:suppressAutoHyphens w:val="true"/>
-      <w:overflowPunct w:val="false"/>
+      <w:overflowPunct w:val="true"/>
       <w:bidi w:val="0"/>
       <w:spacing w:lineRule="atLeast" w:line="240" w:before="0" w:after="120"/>
       <w:jc w:val="both"/>
@@ -43478,7 +43397,7 @@
       <w:tabs>
         <w:tab w:val="clear" w:pos="567"/>
       </w:tabs>
-      <w:overflowPunct w:val="true"/>
+      <w:overflowPunct w:val="false"/>
       <w:spacing w:lineRule="auto" w:line="240" w:before="120" w:after="0"/>
       <w:ind w:left="720" w:right="0" w:firstLine="851"/>
       <w:contextualSpacing/>
@@ -43642,7 +43561,7 @@
     <w:pPr>
       <w:widowControl/>
       <w:suppressAutoHyphens w:val="true"/>
-      <w:overflowPunct w:val="false"/>
+      <w:overflowPunct w:val="true"/>
       <w:bidi w:val="0"/>
       <w:spacing w:before="0" w:after="0"/>
       <w:jc w:val="left"/>

</xml_diff>